<commit_message>
Knowledge - 3-Work knowledge - 1/31/2026 - part 1
</commit_message>
<xml_diff>
--- a/Knowledge/3-Work knowledge/1-Software Engineering/2-Testing/5-My Source/1-ISTQB Foundation Level/1-ISTQB Foundation Level.docx
+++ b/Knowledge/3-Work knowledge/1-Software Engineering/2-Testing/5-My Source/1-ISTQB Foundation Level/1-ISTQB Foundation Level.docx
@@ -50,51 +50,77 @@
       </w:pPr>
       <w:r>
         <w:rPr>
-          <w:b/>
-          <w:shd w:val="clear" w:color="auto" w:fill="B7B7B7"/>
-        </w:rPr>
-        <w:t># Source</w:t>
-      </w:r>
-      <w:r>
-        <w:rPr>
-          <w:shd w:val="clear" w:color="auto" w:fill="B7B7B7"/>
-        </w:rPr>
-        <w:t xml:space="preserve">: </w:t>
-      </w:r>
-      <w:r>
-        <w:rPr>
-          <w:b/>
-          <w:shd w:val="clear" w:color="auto" w:fill="B7B7B7"/>
-        </w:rPr>
-        <w:t xml:space="preserve">Chatgpt </w:t>
-      </w:r>
-      <w:r>
-        <w:rPr>
-          <w:b/>
-          <w:sz w:val="14"/>
-          <w:szCs w:val="14"/>
-          <w:shd w:val="clear" w:color="auto" w:fill="B7B7B7"/>
-        </w:rPr>
-        <w:t>(GPT</w:t>
-      </w:r>
-      <w:r>
-        <w:rPr>
-          <w:rFonts w:ascii="Cambria Math" w:hAnsi="Cambria Math" w:cs="Cambria Math"/>
-          <w:b/>
-          <w:sz w:val="14"/>
-          <w:szCs w:val="14"/>
-          <w:shd w:val="clear" w:color="auto" w:fill="B7B7B7"/>
+          <w:rFonts w:ascii="Arial" w:eastAsia="Arial" w:hAnsi="Arial" w:cs="Arial"/>
+          <w:b/>
+          <w:color w:val="000000"/>
+          <w:sz w:val="18"/>
+          <w:highlight w:val="lightGray"/>
+        </w:rPr>
+        <w:t># Source: AI Source: Provided by: [Data Path</w:t>
+      </w:r>
+      <w:r>
+        <w:rPr>
+          <w:rFonts w:ascii="Arial" w:eastAsia="Arial" w:hAnsi="Arial" w:cs="Arial"/>
+          <w:color w:val="000000"/>
+          <w:sz w:val="18"/>
+          <w:highlight w:val="lightGray"/>
+        </w:rPr>
+        <w:t xml:space="preserve">: Persons Table -&gt; ID Column: 1, Name_En Column: Motasem Essam] -&gt; </w:t>
+      </w:r>
+      <w:r>
+        <w:rPr>
+          <w:rFonts w:ascii="Arial" w:eastAsia="Arial" w:hAnsi="Arial" w:cs="Arial"/>
+          <w:b/>
+          <w:color w:val="000000"/>
+          <w:sz w:val="18"/>
+          <w:highlight w:val="lightGray"/>
+        </w:rPr>
+        <w:t>From:</w:t>
+      </w:r>
+      <w:r>
+        <w:rPr>
+          <w:rFonts w:ascii="Arial" w:eastAsia="Arial" w:hAnsi="Arial" w:cs="Arial"/>
+          <w:color w:val="000000"/>
+          <w:sz w:val="18"/>
+          <w:highlight w:val="lightGray"/>
+        </w:rPr>
+        <w:t xml:space="preserve"> [Chatgpt (GPT</w:t>
+      </w:r>
+      <w:r>
+        <w:rPr>
+          <w:rFonts w:ascii="Arial" w:eastAsia="Arial" w:hAnsi="Arial" w:cs="Cambria Math"/>
+          <w:color w:val="000000"/>
+          <w:sz w:val="18"/>
+          <w:highlight w:val="lightGray"/>
         </w:rPr>
         <w:t>‑</w:t>
       </w:r>
       <w:r>
         <w:rPr>
-          <w:b/>
-          <w:sz w:val="14"/>
-          <w:szCs w:val="14"/>
-          <w:shd w:val="clear" w:color="auto" w:fill="B7B7B7"/>
-        </w:rPr>
-        <w:t>5 Mini) at [8/14/2025]</w:t>
+          <w:rFonts w:ascii="Arial" w:eastAsia="Arial" w:hAnsi="Arial" w:cs="Arial"/>
+          <w:color w:val="000000"/>
+          <w:sz w:val="18"/>
+          <w:highlight w:val="lightGray"/>
+        </w:rPr>
+        <w:t xml:space="preserve">5 Mini)] </w:t>
+      </w:r>
+      <w:r>
+        <w:rPr>
+          <w:rFonts w:ascii="Arial" w:eastAsia="Arial" w:hAnsi="Arial" w:cs="Arial"/>
+          <w:b/>
+          <w:color w:val="000000"/>
+          <w:sz w:val="18"/>
+          <w:highlight w:val="lightGray"/>
+        </w:rPr>
+        <w:t>on</w:t>
+      </w:r>
+      <w:r>
+        <w:rPr>
+          <w:rFonts w:ascii="Arial" w:eastAsia="Arial" w:hAnsi="Arial"/>
+          <w:sz w:val="18"/>
+          <w:highlight w:val="lightGray"/>
+        </w:rPr>
+        <w:t xml:space="preserve"> [8/14/2025]</w:t>
       </w:r>
     </w:p>
     <w:p>
@@ -103,7 +129,7 @@
           <w:ilvl w:val="0"/>
           <w:numId w:val="3"/>
         </w:numPr>
-        <w:spacing w:before="240"/>
+        <w:spacing w:before="240" w:after="0" w:line="276" w:lineRule="auto"/>
       </w:pPr>
       <w:r>
         <w:rPr>
@@ -151,7 +177,7 @@
           <w:ilvl w:val="0"/>
           <w:numId w:val="3"/>
         </w:numPr>
-        <w:spacing w:after="240"/>
+        <w:spacing w:after="240" w:line="276" w:lineRule="auto"/>
       </w:pPr>
       <w:r>
         <w:rPr>
@@ -188,7 +214,7 @@
     </w:p>
     <w:p>
       <w:r>
-        <w:pict w14:anchorId="638F14C8">
+        <w:pict w14:anchorId="138506D8">
           <v:rect id="_x0000_i1025" style="width:0;height:1.5pt" o:hralign="center" o:hrstd="t" o:hr="t" fillcolor="#a0a0a0" stroked="f"/>
         </w:pict>
       </w:r>
@@ -224,51 +250,77 @@
       </w:pPr>
       <w:r>
         <w:rPr>
-          <w:b/>
-          <w:shd w:val="clear" w:color="auto" w:fill="B7B7B7"/>
-        </w:rPr>
-        <w:t># Source</w:t>
-      </w:r>
-      <w:r>
-        <w:rPr>
-          <w:shd w:val="clear" w:color="auto" w:fill="B7B7B7"/>
-        </w:rPr>
-        <w:t xml:space="preserve">: </w:t>
-      </w:r>
-      <w:r>
-        <w:rPr>
-          <w:b/>
-          <w:shd w:val="clear" w:color="auto" w:fill="B7B7B7"/>
-        </w:rPr>
-        <w:t xml:space="preserve">Chatgpt </w:t>
-      </w:r>
-      <w:r>
-        <w:rPr>
-          <w:b/>
-          <w:sz w:val="14"/>
-          <w:szCs w:val="14"/>
-          <w:shd w:val="clear" w:color="auto" w:fill="B7B7B7"/>
-        </w:rPr>
-        <w:t>(GPT</w:t>
-      </w:r>
-      <w:r>
-        <w:rPr>
-          <w:rFonts w:ascii="Cambria Math" w:hAnsi="Cambria Math" w:cs="Cambria Math"/>
-          <w:b/>
-          <w:sz w:val="14"/>
-          <w:szCs w:val="14"/>
-          <w:shd w:val="clear" w:color="auto" w:fill="B7B7B7"/>
+          <w:rFonts w:ascii="Arial" w:eastAsia="Arial" w:hAnsi="Arial" w:cs="Arial"/>
+          <w:b/>
+          <w:color w:val="000000"/>
+          <w:sz w:val="18"/>
+          <w:highlight w:val="lightGray"/>
+        </w:rPr>
+        <w:t># Source: AI Source: Provided by: [Data Path</w:t>
+      </w:r>
+      <w:r>
+        <w:rPr>
+          <w:rFonts w:ascii="Arial" w:eastAsia="Arial" w:hAnsi="Arial" w:cs="Arial"/>
+          <w:color w:val="000000"/>
+          <w:sz w:val="18"/>
+          <w:highlight w:val="lightGray"/>
+        </w:rPr>
+        <w:t xml:space="preserve">: Persons Table -&gt; ID Column: 1, Name_En Column: Motasem Essam] -&gt; </w:t>
+      </w:r>
+      <w:r>
+        <w:rPr>
+          <w:rFonts w:ascii="Arial" w:eastAsia="Arial" w:hAnsi="Arial" w:cs="Arial"/>
+          <w:b/>
+          <w:color w:val="000000"/>
+          <w:sz w:val="18"/>
+          <w:highlight w:val="lightGray"/>
+        </w:rPr>
+        <w:t>From:</w:t>
+      </w:r>
+      <w:r>
+        <w:rPr>
+          <w:rFonts w:ascii="Arial" w:eastAsia="Arial" w:hAnsi="Arial" w:cs="Arial"/>
+          <w:color w:val="000000"/>
+          <w:sz w:val="18"/>
+          <w:highlight w:val="lightGray"/>
+        </w:rPr>
+        <w:t xml:space="preserve"> [Chatgpt (GPT</w:t>
+      </w:r>
+      <w:r>
+        <w:rPr>
+          <w:rFonts w:ascii="Arial" w:eastAsia="Arial" w:hAnsi="Arial" w:cs="Cambria Math"/>
+          <w:color w:val="000000"/>
+          <w:sz w:val="18"/>
+          <w:highlight w:val="lightGray"/>
         </w:rPr>
         <w:t>‑</w:t>
       </w:r>
       <w:r>
         <w:rPr>
-          <w:b/>
-          <w:sz w:val="14"/>
-          <w:szCs w:val="14"/>
-          <w:shd w:val="clear" w:color="auto" w:fill="B7B7B7"/>
-        </w:rPr>
-        <w:t>5 Mini) at [8/14/2025]</w:t>
+          <w:rFonts w:ascii="Arial" w:eastAsia="Arial" w:hAnsi="Arial" w:cs="Arial"/>
+          <w:color w:val="000000"/>
+          <w:sz w:val="18"/>
+          <w:highlight w:val="lightGray"/>
+        </w:rPr>
+        <w:t xml:space="preserve">5 Mini)] </w:t>
+      </w:r>
+      <w:r>
+        <w:rPr>
+          <w:rFonts w:ascii="Arial" w:eastAsia="Arial" w:hAnsi="Arial" w:cs="Arial"/>
+          <w:b/>
+          <w:color w:val="000000"/>
+          <w:sz w:val="18"/>
+          <w:highlight w:val="lightGray"/>
+        </w:rPr>
+        <w:t>on</w:t>
+      </w:r>
+      <w:r>
+        <w:rPr>
+          <w:rFonts w:ascii="Arial" w:eastAsia="Arial" w:hAnsi="Arial"/>
+          <w:sz w:val="18"/>
+          <w:highlight w:val="lightGray"/>
+        </w:rPr>
+        <w:t xml:space="preserve"> [8/14/2025]</w:t>
       </w:r>
     </w:p>
     <w:p>
@@ -291,7 +343,7 @@
           <w:ilvl w:val="0"/>
           <w:numId w:val="1"/>
         </w:numPr>
-        <w:spacing w:before="240"/>
+        <w:spacing w:before="240" w:after="0" w:line="276" w:lineRule="auto"/>
         <w:rPr>
           <w:rFonts w:ascii="Roboto Mono" w:eastAsia="Roboto Mono" w:hAnsi="Roboto Mono" w:cs="Roboto Mono"/>
         </w:rPr>
@@ -315,6 +367,7 @@
           <w:ilvl w:val="0"/>
           <w:numId w:val="1"/>
         </w:numPr>
+        <w:spacing w:after="0" w:line="276" w:lineRule="auto"/>
         <w:rPr>
           <w:rFonts w:ascii="Roboto Mono" w:eastAsia="Roboto Mono" w:hAnsi="Roboto Mono" w:cs="Roboto Mono"/>
         </w:rPr>
@@ -338,6 +391,7 @@
           <w:ilvl w:val="0"/>
           <w:numId w:val="1"/>
         </w:numPr>
+        <w:spacing w:after="0" w:line="276" w:lineRule="auto"/>
         <w:rPr>
           <w:rFonts w:ascii="Roboto Mono" w:eastAsia="Roboto Mono" w:hAnsi="Roboto Mono" w:cs="Roboto Mono"/>
         </w:rPr>
@@ -361,6 +415,7 @@
           <w:ilvl w:val="0"/>
           <w:numId w:val="1"/>
         </w:numPr>
+        <w:spacing w:after="0" w:line="276" w:lineRule="auto"/>
         <w:rPr>
           <w:rFonts w:ascii="Roboto Mono" w:eastAsia="Roboto Mono" w:hAnsi="Roboto Mono" w:cs="Roboto Mono"/>
         </w:rPr>
@@ -384,7 +439,7 @@
           <w:ilvl w:val="0"/>
           <w:numId w:val="1"/>
         </w:numPr>
-        <w:spacing w:after="240"/>
+        <w:spacing w:after="240" w:line="276" w:lineRule="auto"/>
       </w:pPr>
       <w:r>
         <w:rPr>
@@ -398,7 +453,7 @@
     </w:p>
     <w:p>
       <w:r>
-        <w:pict w14:anchorId="031D3239">
+        <w:pict w14:anchorId="716449E8">
           <v:rect id="_x0000_i1026" style="width:0;height:1.5pt" o:hralign="center" o:hrstd="t" o:hr="t" fillcolor="#a0a0a0" stroked="f"/>
         </w:pict>
       </w:r>
@@ -434,51 +489,77 @@
       </w:pPr>
       <w:r>
         <w:rPr>
-          <w:b/>
-          <w:shd w:val="clear" w:color="auto" w:fill="B7B7B7"/>
-        </w:rPr>
-        <w:t># Source</w:t>
-      </w:r>
-      <w:r>
-        <w:rPr>
-          <w:shd w:val="clear" w:color="auto" w:fill="B7B7B7"/>
-        </w:rPr>
-        <w:t xml:space="preserve">: </w:t>
-      </w:r>
-      <w:r>
-        <w:rPr>
-          <w:b/>
-          <w:shd w:val="clear" w:color="auto" w:fill="B7B7B7"/>
-        </w:rPr>
-        <w:t xml:space="preserve">Chatgpt </w:t>
-      </w:r>
-      <w:r>
-        <w:rPr>
-          <w:b/>
-          <w:sz w:val="14"/>
-          <w:szCs w:val="14"/>
-          <w:shd w:val="clear" w:color="auto" w:fill="B7B7B7"/>
-        </w:rPr>
-        <w:t>(GPT</w:t>
-      </w:r>
-      <w:r>
-        <w:rPr>
-          <w:rFonts w:ascii="Cambria Math" w:hAnsi="Cambria Math" w:cs="Cambria Math"/>
-          <w:b/>
-          <w:sz w:val="14"/>
-          <w:szCs w:val="14"/>
-          <w:shd w:val="clear" w:color="auto" w:fill="B7B7B7"/>
+          <w:rFonts w:ascii="Arial" w:eastAsia="Arial" w:hAnsi="Arial" w:cs="Arial"/>
+          <w:b/>
+          <w:color w:val="000000"/>
+          <w:sz w:val="18"/>
+          <w:highlight w:val="lightGray"/>
+        </w:rPr>
+        <w:t># Source: AI Source: Provided by: [Data Path</w:t>
+      </w:r>
+      <w:r>
+        <w:rPr>
+          <w:rFonts w:ascii="Arial" w:eastAsia="Arial" w:hAnsi="Arial" w:cs="Arial"/>
+          <w:color w:val="000000"/>
+          <w:sz w:val="18"/>
+          <w:highlight w:val="lightGray"/>
+        </w:rPr>
+        <w:t xml:space="preserve">: Persons Table -&gt; ID Column: 1, Name_En Column: Motasem Essam] -&gt; </w:t>
+      </w:r>
+      <w:r>
+        <w:rPr>
+          <w:rFonts w:ascii="Arial" w:eastAsia="Arial" w:hAnsi="Arial" w:cs="Arial"/>
+          <w:b/>
+          <w:color w:val="000000"/>
+          <w:sz w:val="18"/>
+          <w:highlight w:val="lightGray"/>
+        </w:rPr>
+        <w:t>From:</w:t>
+      </w:r>
+      <w:r>
+        <w:rPr>
+          <w:rFonts w:ascii="Arial" w:eastAsia="Arial" w:hAnsi="Arial" w:cs="Arial"/>
+          <w:color w:val="000000"/>
+          <w:sz w:val="18"/>
+          <w:highlight w:val="lightGray"/>
+        </w:rPr>
+        <w:t xml:space="preserve"> [Chatgpt (GPT</w:t>
+      </w:r>
+      <w:r>
+        <w:rPr>
+          <w:rFonts w:ascii="Arial" w:eastAsia="Arial" w:hAnsi="Arial" w:cs="Cambria Math"/>
+          <w:color w:val="000000"/>
+          <w:sz w:val="18"/>
+          <w:highlight w:val="lightGray"/>
         </w:rPr>
         <w:t>‑</w:t>
       </w:r>
       <w:r>
         <w:rPr>
-          <w:b/>
-          <w:sz w:val="14"/>
-          <w:szCs w:val="14"/>
-          <w:shd w:val="clear" w:color="auto" w:fill="B7B7B7"/>
-        </w:rPr>
-        <w:t>5 Mini) at [8/14/2025]</w:t>
+          <w:rFonts w:ascii="Arial" w:eastAsia="Arial" w:hAnsi="Arial" w:cs="Arial"/>
+          <w:color w:val="000000"/>
+          <w:sz w:val="18"/>
+          <w:highlight w:val="lightGray"/>
+        </w:rPr>
+        <w:t xml:space="preserve">5 Mini)] </w:t>
+      </w:r>
+      <w:r>
+        <w:rPr>
+          <w:rFonts w:ascii="Arial" w:eastAsia="Arial" w:hAnsi="Arial" w:cs="Arial"/>
+          <w:b/>
+          <w:color w:val="000000"/>
+          <w:sz w:val="18"/>
+          <w:highlight w:val="lightGray"/>
+        </w:rPr>
+        <w:t>on</w:t>
+      </w:r>
+      <w:r>
+        <w:rPr>
+          <w:rFonts w:ascii="Arial" w:eastAsia="Arial" w:hAnsi="Arial"/>
+          <w:sz w:val="18"/>
+          <w:highlight w:val="lightGray"/>
+        </w:rPr>
+        <w:t xml:space="preserve"> [8/14/2025]</w:t>
       </w:r>
     </w:p>
     <w:p>
@@ -487,17 +568,16 @@
           <w:ilvl w:val="0"/>
           <w:numId w:val="2"/>
         </w:numPr>
-        <w:spacing w:before="240"/>
-        <w:rPr>
-          <w:rFonts w:ascii="Roboto Mono" w:eastAsia="Roboto Mono" w:hAnsi="Roboto Mono" w:cs="Roboto Mono"/>
-        </w:rPr>
-      </w:pPr>
-      <w:r>
-        <w:rPr>
-          <w:rFonts w:ascii="Roboto Mono" w:eastAsia="Roboto Mono" w:hAnsi="Roboto Mono" w:cs="Roboto Mono"/>
-          <w:b/>
-        </w:rPr>
-        <w:lastRenderedPageBreak/>
+        <w:spacing w:before="240" w:after="0" w:line="276" w:lineRule="auto"/>
+        <w:rPr>
+          <w:rFonts w:ascii="Roboto Mono" w:eastAsia="Roboto Mono" w:hAnsi="Roboto Mono" w:cs="Roboto Mono"/>
+        </w:rPr>
+      </w:pPr>
+      <w:r>
+        <w:rPr>
+          <w:rFonts w:ascii="Roboto Mono" w:eastAsia="Roboto Mono" w:hAnsi="Roboto Mono" w:cs="Roboto Mono"/>
+          <w:b/>
+        </w:rPr>
         <w:t>Beginners in software testing</w:t>
       </w:r>
       <w:r>
@@ -514,6 +594,7 @@
           <w:ilvl w:val="0"/>
           <w:numId w:val="2"/>
         </w:numPr>
+        <w:spacing w:after="0" w:line="276" w:lineRule="auto"/>
         <w:rPr>
           <w:rFonts w:ascii="Roboto Mono" w:eastAsia="Roboto Mono" w:hAnsi="Roboto Mono" w:cs="Roboto Mono"/>
         </w:rPr>
@@ -537,7 +618,7 @@
           <w:ilvl w:val="0"/>
           <w:numId w:val="2"/>
         </w:numPr>
-        <w:spacing w:after="240"/>
+        <w:spacing w:after="240" w:line="276" w:lineRule="auto"/>
         <w:rPr>
           <w:rFonts w:ascii="Roboto Mono" w:eastAsia="Roboto Mono" w:hAnsi="Roboto Mono" w:cs="Roboto Mono"/>
         </w:rPr>
@@ -557,7 +638,7 @@
     </w:p>
     <w:p>
       <w:r>
-        <w:pict w14:anchorId="121C67F6">
+        <w:pict w14:anchorId="2F744763">
           <v:rect id="_x0000_i1027" style="width:0;height:1.5pt" o:hralign="center" o:hrstd="t" o:hr="t" fillcolor="#a0a0a0" stroked="f"/>
         </w:pict>
       </w:r>
@@ -593,51 +674,77 @@
       </w:pPr>
       <w:r>
         <w:rPr>
-          <w:b/>
-          <w:shd w:val="clear" w:color="auto" w:fill="B7B7B7"/>
-        </w:rPr>
-        <w:t># Source</w:t>
-      </w:r>
-      <w:r>
-        <w:rPr>
-          <w:shd w:val="clear" w:color="auto" w:fill="B7B7B7"/>
-        </w:rPr>
-        <w:t xml:space="preserve">: </w:t>
-      </w:r>
-      <w:r>
-        <w:rPr>
-          <w:b/>
-          <w:shd w:val="clear" w:color="auto" w:fill="B7B7B7"/>
-        </w:rPr>
-        <w:t xml:space="preserve">Chatgpt </w:t>
-      </w:r>
-      <w:r>
-        <w:rPr>
-          <w:b/>
-          <w:sz w:val="14"/>
-          <w:szCs w:val="14"/>
-          <w:shd w:val="clear" w:color="auto" w:fill="B7B7B7"/>
-        </w:rPr>
-        <w:t>(GPT</w:t>
-      </w:r>
-      <w:r>
-        <w:rPr>
-          <w:rFonts w:ascii="Cambria Math" w:hAnsi="Cambria Math" w:cs="Cambria Math"/>
-          <w:b/>
-          <w:sz w:val="14"/>
-          <w:szCs w:val="14"/>
-          <w:shd w:val="clear" w:color="auto" w:fill="B7B7B7"/>
+          <w:rFonts w:ascii="Arial" w:eastAsia="Arial" w:hAnsi="Arial" w:cs="Arial"/>
+          <w:b/>
+          <w:color w:val="000000"/>
+          <w:sz w:val="18"/>
+          <w:highlight w:val="lightGray"/>
+        </w:rPr>
+        <w:t># Source: AI Source: Provided by: [Data Path</w:t>
+      </w:r>
+      <w:r>
+        <w:rPr>
+          <w:rFonts w:ascii="Arial" w:eastAsia="Arial" w:hAnsi="Arial" w:cs="Arial"/>
+          <w:color w:val="000000"/>
+          <w:sz w:val="18"/>
+          <w:highlight w:val="lightGray"/>
+        </w:rPr>
+        <w:t xml:space="preserve">: Persons Table -&gt; ID Column: 1, Name_En Column: Motasem Essam] -&gt; </w:t>
+      </w:r>
+      <w:r>
+        <w:rPr>
+          <w:rFonts w:ascii="Arial" w:eastAsia="Arial" w:hAnsi="Arial" w:cs="Arial"/>
+          <w:b/>
+          <w:color w:val="000000"/>
+          <w:sz w:val="18"/>
+          <w:highlight w:val="lightGray"/>
+        </w:rPr>
+        <w:t>From:</w:t>
+      </w:r>
+      <w:r>
+        <w:rPr>
+          <w:rFonts w:ascii="Arial" w:eastAsia="Arial" w:hAnsi="Arial" w:cs="Arial"/>
+          <w:color w:val="000000"/>
+          <w:sz w:val="18"/>
+          <w:highlight w:val="lightGray"/>
+        </w:rPr>
+        <w:t xml:space="preserve"> [Chatgpt (GPT</w:t>
+      </w:r>
+      <w:r>
+        <w:rPr>
+          <w:rFonts w:ascii="Arial" w:eastAsia="Arial" w:hAnsi="Arial" w:cs="Cambria Math"/>
+          <w:color w:val="000000"/>
+          <w:sz w:val="18"/>
+          <w:highlight w:val="lightGray"/>
         </w:rPr>
         <w:t>‑</w:t>
       </w:r>
       <w:r>
         <w:rPr>
-          <w:b/>
-          <w:sz w:val="14"/>
-          <w:szCs w:val="14"/>
-          <w:shd w:val="clear" w:color="auto" w:fill="B7B7B7"/>
-        </w:rPr>
-        <w:t>5 Mini) at [8/14/2025]</w:t>
+          <w:rFonts w:ascii="Arial" w:eastAsia="Arial" w:hAnsi="Arial" w:cs="Arial"/>
+          <w:color w:val="000000"/>
+          <w:sz w:val="18"/>
+          <w:highlight w:val="lightGray"/>
+        </w:rPr>
+        <w:t xml:space="preserve">5 Mini)] </w:t>
+      </w:r>
+      <w:r>
+        <w:rPr>
+          <w:rFonts w:ascii="Arial" w:eastAsia="Arial" w:hAnsi="Arial" w:cs="Arial"/>
+          <w:b/>
+          <w:color w:val="000000"/>
+          <w:sz w:val="18"/>
+          <w:highlight w:val="lightGray"/>
+        </w:rPr>
+        <w:t>on</w:t>
+      </w:r>
+      <w:r>
+        <w:rPr>
+          <w:rFonts w:ascii="Arial" w:eastAsia="Arial" w:hAnsi="Arial"/>
+          <w:sz w:val="18"/>
+          <w:highlight w:val="lightGray"/>
+        </w:rPr>
+        <w:t xml:space="preserve"> [8/14/2025]</w:t>
       </w:r>
     </w:p>
     <w:p>
@@ -646,7 +753,7 @@
           <w:ilvl w:val="0"/>
           <w:numId w:val="4"/>
         </w:numPr>
-        <w:spacing w:before="240"/>
+        <w:spacing w:before="240" w:after="0" w:line="276" w:lineRule="auto"/>
         <w:rPr>
           <w:rFonts w:ascii="Roboto Mono" w:eastAsia="Roboto Mono" w:hAnsi="Roboto Mono" w:cs="Roboto Mono"/>
         </w:rPr>
@@ -672,6 +779,7 @@
           <w:ilvl w:val="1"/>
           <w:numId w:val="4"/>
         </w:numPr>
+        <w:spacing w:after="0" w:line="276" w:lineRule="auto"/>
         <w:rPr>
           <w:rFonts w:ascii="Roboto Mono" w:eastAsia="Roboto Mono" w:hAnsi="Roboto Mono" w:cs="Roboto Mono"/>
         </w:rPr>
@@ -695,6 +803,7 @@
           <w:ilvl w:val="1"/>
           <w:numId w:val="4"/>
         </w:numPr>
+        <w:spacing w:after="0" w:line="276" w:lineRule="auto"/>
         <w:rPr>
           <w:rFonts w:ascii="Roboto Mono" w:eastAsia="Roboto Mono" w:hAnsi="Roboto Mono" w:cs="Roboto Mono"/>
         </w:rPr>
@@ -718,6 +827,7 @@
           <w:ilvl w:val="1"/>
           <w:numId w:val="4"/>
         </w:numPr>
+        <w:spacing w:after="0" w:line="276" w:lineRule="auto"/>
         <w:rPr>
           <w:rFonts w:ascii="Roboto Mono" w:eastAsia="Roboto Mono" w:hAnsi="Roboto Mono" w:cs="Roboto Mono"/>
         </w:rPr>
@@ -741,6 +851,7 @@
           <w:ilvl w:val="0"/>
           <w:numId w:val="4"/>
         </w:numPr>
+        <w:spacing w:after="0" w:line="276" w:lineRule="auto"/>
         <w:rPr>
           <w:rFonts w:ascii="Roboto Mono" w:eastAsia="Roboto Mono" w:hAnsi="Roboto Mono" w:cs="Roboto Mono"/>
         </w:rPr>
@@ -766,6 +877,7 @@
           <w:ilvl w:val="1"/>
           <w:numId w:val="4"/>
         </w:numPr>
+        <w:spacing w:after="0" w:line="276" w:lineRule="auto"/>
         <w:rPr>
           <w:rFonts w:ascii="Roboto Mono" w:eastAsia="Roboto Mono" w:hAnsi="Roboto Mono" w:cs="Roboto Mono"/>
         </w:rPr>
@@ -789,6 +901,7 @@
           <w:ilvl w:val="1"/>
           <w:numId w:val="4"/>
         </w:numPr>
+        <w:spacing w:after="0" w:line="276" w:lineRule="auto"/>
         <w:rPr>
           <w:rFonts w:ascii="Roboto Mono" w:eastAsia="Roboto Mono" w:hAnsi="Roboto Mono" w:cs="Roboto Mono"/>
         </w:rPr>
@@ -812,6 +925,7 @@
           <w:ilvl w:val="0"/>
           <w:numId w:val="4"/>
         </w:numPr>
+        <w:spacing w:after="0" w:line="276" w:lineRule="auto"/>
         <w:rPr>
           <w:rFonts w:ascii="Roboto Mono" w:eastAsia="Roboto Mono" w:hAnsi="Roboto Mono" w:cs="Roboto Mono"/>
         </w:rPr>
@@ -837,6 +951,7 @@
           <w:ilvl w:val="1"/>
           <w:numId w:val="4"/>
         </w:numPr>
+        <w:spacing w:after="0" w:line="276" w:lineRule="auto"/>
         <w:rPr>
           <w:rFonts w:ascii="Roboto Mono" w:eastAsia="Roboto Mono" w:hAnsi="Roboto Mono" w:cs="Roboto Mono"/>
         </w:rPr>
@@ -860,6 +975,7 @@
           <w:ilvl w:val="0"/>
           <w:numId w:val="4"/>
         </w:numPr>
+        <w:spacing w:after="0" w:line="276" w:lineRule="auto"/>
         <w:rPr>
           <w:rFonts w:ascii="Roboto Mono" w:eastAsia="Roboto Mono" w:hAnsi="Roboto Mono" w:cs="Roboto Mono"/>
         </w:rPr>
@@ -885,6 +1001,7 @@
           <w:ilvl w:val="1"/>
           <w:numId w:val="4"/>
         </w:numPr>
+        <w:spacing w:after="0" w:line="276" w:lineRule="auto"/>
         <w:rPr>
           <w:rFonts w:ascii="Roboto Mono" w:eastAsia="Roboto Mono" w:hAnsi="Roboto Mono" w:cs="Roboto Mono"/>
         </w:rPr>
@@ -908,6 +1025,7 @@
           <w:ilvl w:val="1"/>
           <w:numId w:val="4"/>
         </w:numPr>
+        <w:spacing w:after="0" w:line="276" w:lineRule="auto"/>
         <w:rPr>
           <w:rFonts w:ascii="Roboto Mono" w:eastAsia="Roboto Mono" w:hAnsi="Roboto Mono" w:cs="Roboto Mono"/>
         </w:rPr>
@@ -931,16 +1049,16 @@
           <w:ilvl w:val="0"/>
           <w:numId w:val="4"/>
         </w:numPr>
-        <w:rPr>
-          <w:rFonts w:ascii="Roboto Mono" w:eastAsia="Roboto Mono" w:hAnsi="Roboto Mono" w:cs="Roboto Mono"/>
-        </w:rPr>
-      </w:pPr>
-      <w:r>
-        <w:rPr>
-          <w:rFonts w:ascii="Roboto Mono" w:eastAsia="Roboto Mono" w:hAnsi="Roboto Mono" w:cs="Roboto Mono"/>
-          <w:b/>
-        </w:rPr>
-        <w:lastRenderedPageBreak/>
+        <w:spacing w:after="0" w:line="276" w:lineRule="auto"/>
+        <w:rPr>
+          <w:rFonts w:ascii="Roboto Mono" w:eastAsia="Roboto Mono" w:hAnsi="Roboto Mono" w:cs="Roboto Mono"/>
+        </w:rPr>
+      </w:pPr>
+      <w:r>
+        <w:rPr>
+          <w:rFonts w:ascii="Roboto Mono" w:eastAsia="Roboto Mono" w:hAnsi="Roboto Mono" w:cs="Roboto Mono"/>
+          <w:b/>
+        </w:rPr>
         <w:t>Test Management</w:t>
       </w:r>
       <w:r>
@@ -957,6 +1075,7 @@
           <w:ilvl w:val="1"/>
           <w:numId w:val="4"/>
         </w:numPr>
+        <w:spacing w:after="0" w:line="276" w:lineRule="auto"/>
         <w:rPr>
           <w:rFonts w:ascii="Roboto Mono" w:eastAsia="Roboto Mono" w:hAnsi="Roboto Mono" w:cs="Roboto Mono"/>
         </w:rPr>
@@ -980,6 +1099,7 @@
           <w:ilvl w:val="0"/>
           <w:numId w:val="4"/>
         </w:numPr>
+        <w:spacing w:after="0" w:line="276" w:lineRule="auto"/>
         <w:rPr>
           <w:rFonts w:ascii="Roboto Mono" w:eastAsia="Roboto Mono" w:hAnsi="Roboto Mono" w:cs="Roboto Mono"/>
         </w:rPr>
@@ -1005,7 +1125,7 @@
           <w:ilvl w:val="1"/>
           <w:numId w:val="4"/>
         </w:numPr>
-        <w:spacing w:after="240"/>
+        <w:spacing w:after="240" w:line="276" w:lineRule="auto"/>
         <w:rPr>
           <w:rFonts w:ascii="Roboto Mono" w:eastAsia="Roboto Mono" w:hAnsi="Roboto Mono" w:cs="Roboto Mono"/>
         </w:rPr>
@@ -1030,7 +1150,7 @@
         </w:rPr>
       </w:pPr>
       <w:r>
-        <w:pict w14:anchorId="66CD0522">
+        <w:pict w14:anchorId="1AE36F6B">
           <v:rect id="_x0000_i1028" style="width:0;height:1.5pt" o:hralign="center" o:hrstd="t" o:hr="t" fillcolor="#a0a0a0" stroked="f"/>
         </w:pict>
       </w:r>
@@ -1084,11 +1204,12 @@
     </w:p>
     <w:p>
       <w:r>
-        <w:pict w14:anchorId="624AE61B">
+        <w:pict w14:anchorId="2236162B">
           <v:rect id="_x0000_i1029" style="width:0;height:1.5pt" o:hralign="center" o:hrstd="t" o:hr="t" fillcolor="#a0a0a0" stroked="f"/>
         </w:pict>
       </w:r>
     </w:p>
+    <w:p/>
     <w:p/>
     <w:p/>
     <w:p/>
@@ -1096,8 +1217,8 @@
     <w:sectPr>
       <w:pgSz w:w="12240" w:h="15840"/>
       <w:pgMar w:top="1440" w:right="1440" w:bottom="1440" w:left="1440" w:header="720" w:footer="720" w:gutter="0"/>
-      <w:pgNumType w:start="1"/>
       <w:cols w:space="720"/>
+      <w:docGrid w:linePitch="360"/>
     </w:sectPr>
   </w:body>
 </w:document>
@@ -1972,18 +2093,6 @@
   <w:style w:type="paragraph" w:default="1" w:styleId="Normal">
     <w:name w:val="Normal"/>
     <w:qFormat/>
-    <w:rsid w:val="0034039C"/>
-    <w:pPr>
-      <w:spacing w:after="0" w:line="276" w:lineRule="auto"/>
-    </w:pPr>
-    <w:rPr>
-      <w:rFonts w:ascii="Arial" w:eastAsia="Arial" w:hAnsi="Arial" w:cs="Arial"/>
-      <w:kern w:val="0"/>
-      <w:sz w:val="22"/>
-      <w:szCs w:val="22"/>
-      <w:lang w:val="en"/>
-      <w14:ligatures w14:val="none"/>
-    </w:rPr>
   </w:style>
   <w:style w:type="paragraph" w:styleId="Heading1">
     <w:name w:val="heading 1"/>
@@ -1992,7 +2101,7 @@
     <w:link w:val="Heading1Char"/>
     <w:uiPriority w:val="9"/>
     <w:qFormat/>
-    <w:rsid w:val="00F36CCA"/>
+    <w:rsid w:val="005138CD"/>
     <w:pPr>
       <w:keepNext/>
       <w:keepLines/>
@@ -2015,7 +2124,7 @@
     <w:semiHidden/>
     <w:unhideWhenUsed/>
     <w:qFormat/>
-    <w:rsid w:val="00F36CCA"/>
+    <w:rsid w:val="005138CD"/>
     <w:pPr>
       <w:keepNext/>
       <w:keepLines/>
@@ -2037,7 +2146,7 @@
     <w:uiPriority w:val="9"/>
     <w:unhideWhenUsed/>
     <w:qFormat/>
-    <w:rsid w:val="00F36CCA"/>
+    <w:rsid w:val="005138CD"/>
     <w:pPr>
       <w:keepNext/>
       <w:keepLines/>
@@ -2060,7 +2169,7 @@
     <w:semiHidden/>
     <w:unhideWhenUsed/>
     <w:qFormat/>
-    <w:rsid w:val="00F36CCA"/>
+    <w:rsid w:val="005138CD"/>
     <w:pPr>
       <w:keepNext/>
       <w:keepLines/>
@@ -2083,7 +2192,7 @@
     <w:semiHidden/>
     <w:unhideWhenUsed/>
     <w:qFormat/>
-    <w:rsid w:val="00F36CCA"/>
+    <w:rsid w:val="005138CD"/>
     <w:pPr>
       <w:keepNext/>
       <w:keepLines/>
@@ -2104,11 +2213,11 @@
     <w:semiHidden/>
     <w:unhideWhenUsed/>
     <w:qFormat/>
-    <w:rsid w:val="00F36CCA"/>
+    <w:rsid w:val="005138CD"/>
     <w:pPr>
       <w:keepNext/>
       <w:keepLines/>
-      <w:spacing w:before="40"/>
+      <w:spacing w:before="40" w:after="0"/>
       <w:outlineLvl w:val="5"/>
     </w:pPr>
     <w:rPr>
@@ -2127,11 +2236,11 @@
     <w:semiHidden/>
     <w:unhideWhenUsed/>
     <w:qFormat/>
-    <w:rsid w:val="00F36CCA"/>
+    <w:rsid w:val="005138CD"/>
     <w:pPr>
       <w:keepNext/>
       <w:keepLines/>
-      <w:spacing w:before="40"/>
+      <w:spacing w:before="40" w:after="0"/>
       <w:outlineLvl w:val="6"/>
     </w:pPr>
     <w:rPr>
@@ -2148,10 +2257,11 @@
     <w:semiHidden/>
     <w:unhideWhenUsed/>
     <w:qFormat/>
-    <w:rsid w:val="00F36CCA"/>
+    <w:rsid w:val="005138CD"/>
     <w:pPr>
       <w:keepNext/>
       <w:keepLines/>
+      <w:spacing w:after="0"/>
       <w:outlineLvl w:val="7"/>
     </w:pPr>
     <w:rPr>
@@ -2170,10 +2280,11 @@
     <w:semiHidden/>
     <w:unhideWhenUsed/>
     <w:qFormat/>
-    <w:rsid w:val="00F36CCA"/>
+    <w:rsid w:val="005138CD"/>
     <w:pPr>
       <w:keepNext/>
       <w:keepLines/>
+      <w:spacing w:after="0"/>
       <w:outlineLvl w:val="8"/>
     </w:pPr>
     <w:rPr>
@@ -2213,7 +2324,7 @@
     <w:basedOn w:val="DefaultParagraphFont"/>
     <w:link w:val="Heading1"/>
     <w:uiPriority w:val="9"/>
-    <w:rsid w:val="00F36CCA"/>
+    <w:rsid w:val="005138CD"/>
     <w:rPr>
       <w:rFonts w:asciiTheme="majorHAnsi" w:eastAsiaTheme="majorEastAsia" w:hAnsiTheme="majorHAnsi" w:cstheme="majorBidi"/>
       <w:color w:val="2F5496" w:themeColor="accent1" w:themeShade="BF"/>
@@ -2227,7 +2338,7 @@
     <w:link w:val="Heading2"/>
     <w:uiPriority w:val="9"/>
     <w:semiHidden/>
-    <w:rsid w:val="00F36CCA"/>
+    <w:rsid w:val="005138CD"/>
     <w:rPr>
       <w:rFonts w:asciiTheme="majorHAnsi" w:eastAsiaTheme="majorEastAsia" w:hAnsiTheme="majorHAnsi" w:cstheme="majorBidi"/>
       <w:color w:val="2F5496" w:themeColor="accent1" w:themeShade="BF"/>
@@ -2240,7 +2351,7 @@
     <w:basedOn w:val="DefaultParagraphFont"/>
     <w:link w:val="Heading3"/>
     <w:uiPriority w:val="9"/>
-    <w:rsid w:val="00F36CCA"/>
+    <w:rsid w:val="005138CD"/>
     <w:rPr>
       <w:rFonts w:eastAsiaTheme="majorEastAsia" w:cstheme="majorBidi"/>
       <w:color w:val="2F5496" w:themeColor="accent1" w:themeShade="BF"/>
@@ -2254,7 +2365,7 @@
     <w:link w:val="Heading4"/>
     <w:uiPriority w:val="9"/>
     <w:semiHidden/>
-    <w:rsid w:val="00F36CCA"/>
+    <w:rsid w:val="005138CD"/>
     <w:rPr>
       <w:rFonts w:eastAsiaTheme="majorEastAsia" w:cstheme="majorBidi"/>
       <w:i/>
@@ -2268,7 +2379,7 @@
     <w:link w:val="Heading5"/>
     <w:uiPriority w:val="9"/>
     <w:semiHidden/>
-    <w:rsid w:val="00F36CCA"/>
+    <w:rsid w:val="005138CD"/>
     <w:rPr>
       <w:rFonts w:eastAsiaTheme="majorEastAsia" w:cstheme="majorBidi"/>
       <w:color w:val="2F5496" w:themeColor="accent1" w:themeShade="BF"/>
@@ -2280,7 +2391,7 @@
     <w:link w:val="Heading6"/>
     <w:uiPriority w:val="9"/>
     <w:semiHidden/>
-    <w:rsid w:val="00F36CCA"/>
+    <w:rsid w:val="005138CD"/>
     <w:rPr>
       <w:rFonts w:eastAsiaTheme="majorEastAsia" w:cstheme="majorBidi"/>
       <w:i/>
@@ -2294,7 +2405,7 @@
     <w:link w:val="Heading7"/>
     <w:uiPriority w:val="9"/>
     <w:semiHidden/>
-    <w:rsid w:val="00F36CCA"/>
+    <w:rsid w:val="005138CD"/>
     <w:rPr>
       <w:rFonts w:eastAsiaTheme="majorEastAsia" w:cstheme="majorBidi"/>
       <w:color w:val="595959" w:themeColor="text1" w:themeTint="A6"/>
@@ -2306,7 +2417,7 @@
     <w:link w:val="Heading8"/>
     <w:uiPriority w:val="9"/>
     <w:semiHidden/>
-    <w:rsid w:val="00F36CCA"/>
+    <w:rsid w:val="005138CD"/>
     <w:rPr>
       <w:rFonts w:eastAsiaTheme="majorEastAsia" w:cstheme="majorBidi"/>
       <w:i/>
@@ -2320,7 +2431,7 @@
     <w:link w:val="Heading9"/>
     <w:uiPriority w:val="9"/>
     <w:semiHidden/>
-    <w:rsid w:val="00F36CCA"/>
+    <w:rsid w:val="005138CD"/>
     <w:rPr>
       <w:rFonts w:eastAsiaTheme="majorEastAsia" w:cstheme="majorBidi"/>
       <w:color w:val="272727" w:themeColor="text1" w:themeTint="D8"/>
@@ -2333,7 +2444,7 @@
     <w:link w:val="TitleChar"/>
     <w:uiPriority w:val="10"/>
     <w:qFormat/>
-    <w:rsid w:val="00F36CCA"/>
+    <w:rsid w:val="005138CD"/>
     <w:pPr>
       <w:spacing w:after="80" w:line="240" w:lineRule="auto"/>
       <w:contextualSpacing/>
@@ -2351,7 +2462,7 @@
     <w:basedOn w:val="DefaultParagraphFont"/>
     <w:link w:val="Title"/>
     <w:uiPriority w:val="10"/>
-    <w:rsid w:val="00F36CCA"/>
+    <w:rsid w:val="005138CD"/>
     <w:rPr>
       <w:rFonts w:asciiTheme="majorHAnsi" w:eastAsiaTheme="majorEastAsia" w:hAnsiTheme="majorHAnsi" w:cstheme="majorBidi"/>
       <w:spacing w:val="-10"/>
@@ -2367,7 +2478,7 @@
     <w:link w:val="SubtitleChar"/>
     <w:uiPriority w:val="11"/>
     <w:qFormat/>
-    <w:rsid w:val="00F36CCA"/>
+    <w:rsid w:val="005138CD"/>
     <w:pPr>
       <w:numPr>
         <w:ilvl w:val="1"/>
@@ -2386,7 +2497,7 @@
     <w:basedOn w:val="DefaultParagraphFont"/>
     <w:link w:val="Subtitle"/>
     <w:uiPriority w:val="11"/>
-    <w:rsid w:val="00F36CCA"/>
+    <w:rsid w:val="005138CD"/>
     <w:rPr>
       <w:rFonts w:eastAsiaTheme="majorEastAsia" w:cstheme="majorBidi"/>
       <w:color w:val="595959" w:themeColor="text1" w:themeTint="A6"/>
@@ -2402,7 +2513,7 @@
     <w:link w:val="QuoteChar"/>
     <w:uiPriority w:val="29"/>
     <w:qFormat/>
-    <w:rsid w:val="00F36CCA"/>
+    <w:rsid w:val="005138CD"/>
     <w:pPr>
       <w:spacing w:before="160"/>
       <w:jc w:val="center"/>
@@ -2418,7 +2529,7 @@
     <w:basedOn w:val="DefaultParagraphFont"/>
     <w:link w:val="Quote"/>
     <w:uiPriority w:val="29"/>
-    <w:rsid w:val="00F36CCA"/>
+    <w:rsid w:val="005138CD"/>
     <w:rPr>
       <w:i/>
       <w:iCs/>
@@ -2430,7 +2541,7 @@
     <w:basedOn w:val="Normal"/>
     <w:uiPriority w:val="34"/>
     <w:qFormat/>
-    <w:rsid w:val="00F36CCA"/>
+    <w:rsid w:val="005138CD"/>
     <w:pPr>
       <w:ind w:left="720"/>
       <w:contextualSpacing/>
@@ -2441,7 +2552,7 @@
     <w:basedOn w:val="DefaultParagraphFont"/>
     <w:uiPriority w:val="21"/>
     <w:qFormat/>
-    <w:rsid w:val="00F36CCA"/>
+    <w:rsid w:val="005138CD"/>
     <w:rPr>
       <w:i/>
       <w:iCs/>
@@ -2455,7 +2566,7 @@
     <w:link w:val="IntenseQuoteChar"/>
     <w:uiPriority w:val="30"/>
     <w:qFormat/>
-    <w:rsid w:val="00F36CCA"/>
+    <w:rsid w:val="005138CD"/>
     <w:pPr>
       <w:pBdr>
         <w:top w:val="single" w:sz="4" w:space="10" w:color="2F5496" w:themeColor="accent1" w:themeShade="BF"/>
@@ -2476,7 +2587,7 @@
     <w:basedOn w:val="DefaultParagraphFont"/>
     <w:link w:val="IntenseQuote"/>
     <w:uiPriority w:val="30"/>
-    <w:rsid w:val="00F36CCA"/>
+    <w:rsid w:val="005138CD"/>
     <w:rPr>
       <w:i/>
       <w:iCs/>
@@ -2488,7 +2599,7 @@
     <w:basedOn w:val="DefaultParagraphFont"/>
     <w:uiPriority w:val="32"/>
     <w:qFormat/>
-    <w:rsid w:val="00F36CCA"/>
+    <w:rsid w:val="005138CD"/>
     <w:rPr>
       <w:b/>
       <w:bCs/>

</xml_diff>